<commit_message>
Update Kenya guide and Excel for 2000-row pages and new sample payloads.
Set page size to 2000, restore a bold Confidential v1.0 page footer, drop Country, use the token URL in credentials, and refresh Invoice/Order/Product/Stock samples.

Co-authored-by: soniarun532-rgb <soniarun532-rgb@users.noreply.github.com>
</commit_message>
<xml_diff>
--- a/docs/SAT-Datashare-Client-Test-Guide-Kenya-v1.0.docx
+++ b/docs/SAT-Datashare-Client-Test-Guide-Kenya-v1.0.docx
@@ -261,66 +261,6 @@
                 <w:sz w:val="20"/>
               </w:rPr>
               <w:t>https://exp-sat-datashare-prod-api-vx7q2k.2ky31l-1.deu-c1.eu1.cloudhub.io</w:t>
-            </w:r>
-          </w:p>
-        </w:tc>
-      </w:tr>
-      <w:tr>
-        <w:trPr>
-          <w:cantSplit/>
-        </w:trPr>
-        <w:tc>
-          <w:tcPr>
-            <w:tcW w:type="dxa" w:w="2948"/>
-            <w:shd w:fill="E9F0F7" w:val="clear"/>
-            <w:tcBorders>
-              <w:top w:val="single" w:sz="4" w:space="0" w:color="BFBFBF"/>
-              <w:left w:val="single" w:sz="4" w:space="0" w:color="BFBFBF"/>
-              <w:bottom w:val="single" w:sz="4" w:space="0" w:color="BFBFBF"/>
-              <w:right w:val="single" w:sz="4" w:space="0" w:color="BFBFBF"/>
-            </w:tcBorders>
-          </w:tcPr>
-          <w:p>
-            <w:pPr>
-              <w:spacing w:before="40" w:after="40"/>
-            </w:pPr>
-            <w:r/>
-            <w:r>
-              <w:rPr>
-                <w:rFonts w:ascii="Calibri" w:hAnsi="Calibri" w:cs="Calibri" w:eastAsia="Calibri"/>
-                <w:b/>
-                <w:i w:val="0"/>
-                <w:color w:val="2D2D2D"/>
-                <w:sz w:val="20"/>
-              </w:rPr>
-              <w:t>Country</w:t>
-            </w:r>
-          </w:p>
-        </w:tc>
-        <w:tc>
-          <w:tcPr>
-            <w:tcW w:type="dxa" w:w="6917"/>
-            <w:tcBorders>
-              <w:top w:val="single" w:sz="4" w:space="0" w:color="BFBFBF"/>
-              <w:left w:val="single" w:sz="4" w:space="0" w:color="BFBFBF"/>
-              <w:bottom w:val="single" w:sz="4" w:space="0" w:color="BFBFBF"/>
-              <w:right w:val="single" w:sz="4" w:space="0" w:color="BFBFBF"/>
-            </w:tcBorders>
-          </w:tcPr>
-          <w:p>
-            <w:pPr>
-              <w:spacing w:before="40" w:after="40"/>
-            </w:pPr>
-            <w:r/>
-            <w:r>
-              <w:rPr>
-                <w:rFonts w:ascii="Calibri" w:hAnsi="Calibri" w:cs="Calibri" w:eastAsia="Calibri"/>
-                <w:b w:val="0"/>
-                <w:i w:val="0"/>
-                <w:color w:val="2D2D2D"/>
-                <w:sz w:val="20"/>
-              </w:rPr>
-              <w:t>Kenya (derived from your client ID — do not send this)</w:t>
             </w:r>
           </w:p>
         </w:tc>
@@ -620,7 +560,7 @@
                 <w:color w:val="2D2D2D"/>
                 <w:sz w:val="20"/>
               </w:rPr>
-              <w:t>Up to 10,000 rows per page</w:t>
+              <w:t>Up to 2,000 rows per page</w:t>
             </w:r>
           </w:p>
         </w:tc>
@@ -748,7 +688,7 @@
                 <w:color w:val="2D2D2D"/>
                 <w:sz w:val="19"/>
               </w:rPr>
-              <w:t>Tenant ID</w:t>
+              <w:t>access_token_url</w:t>
             </w:r>
           </w:p>
         </w:tc>
@@ -776,7 +716,7 @@
                 <w:color w:val="2D2D2D"/>
                 <w:sz w:val="19"/>
               </w:rPr>
-              <w:t>f4faf003-d90b-4832-9df8-c8a22d29bdd4</w:t>
+              <w:t>https://login.microsoftonline.com/f4faf003-d90b-4832-9df8-c8a22d29bdd4/oauth2/v2.0/token</w:t>
             </w:r>
           </w:p>
         </w:tc>
@@ -2025,7 +1965,7 @@
           <w:color w:val="2D2D2D"/>
           <w:sz w:val="22"/>
         </w:rPr>
-        <w:t>Each page contains up to 10,000 rows. pageNumber starts at 0. If another page exists, the body includes a next URL. The last page has no next field — stop when next is absent.</w:t>
+        <w:t>Each page contains up to 2,000 rows. pageNumber starts at 0. If another page exists, the body includes a next URL. The last page has no next field — stop when next is absent.</w:t>
       </w:r>
     </w:p>
     <w:tbl>
@@ -2156,7 +2096,7 @@
                 <w:color w:val="2D2D2D"/>
                 <w:sz w:val="19"/>
               </w:rPr>
-              <w:t>Up to 10,000 rows on this page</w:t>
+              <w:t>Up to 2,000 rows on this page</w:t>
             </w:r>
           </w:p>
         </w:tc>
@@ -2412,29 +2352,29 @@
               <w:br/>
               <w:t xml:space="preserve">    {</w:t>
               <w:br/>
-              <w:t xml:space="preserve">      "STOREID": 2655,</w:t>
+              <w:t xml:space="preserve">      "StoreID": 2151,</w:t>
               <w:br/>
               <w:t xml:space="preserve">      "Discount": 0,</w:t>
               <w:br/>
-              <w:t xml:space="preserve">      "SalesRepID": 111,</w:t>
+              <w:t xml:space="preserve">      "SalesRepID": 112,</w:t>
               <w:br/>
-              <w:t xml:space="preserve">      "VATAmount": "80.46",</w:t>
+              <w:t xml:space="preserve">      "VATAmount": "49.04",</w:t>
               <w:br/>
               <w:t xml:space="preserve">      "RouteID": "",</w:t>
               <w:br/>
               <w:t xml:space="preserve">      "DistributorID": "1000097205",</w:t>
               <w:br/>
-              <w:t xml:space="preserve">      "ProductID": "3286535",</w:t>
+              <w:t xml:space="preserve">      "ProductID": "0238167",</w:t>
               <w:br/>
               <w:t xml:space="preserve">      "WarehouseID": 1925,</w:t>
               <w:br/>
-              <w:t xml:space="preserve">      "OrderNumber": 265,</w:t>
+              <w:t xml:space="preserve">      "OrderNumber": 286,</w:t>
               <w:br/>
-              <w:t xml:space="preserve">      "InvoiceNumber": 2857,</w:t>
+              <w:t xml:space="preserve">      "InvoiceNumber": 2901,</w:t>
               <w:br/>
-              <w:t xml:space="preserve">      "InvoiceDate": "24/09/2026",</w:t>
+              <w:t xml:space="preserve">      "InvoiceDate": "25/09/2026",</w:t>
               <w:br/>
-              <w:t xml:space="preserve">      "InvoiceTime": "15:46:26",</w:t>
+              <w:t xml:space="preserve">      "InvoiceTime": "15:15:36",</w:t>
               <w:br/>
               <w:t xml:space="preserve">      "InvoiceStatus": "Delivered",</w:t>
               <w:br/>
@@ -2442,15 +2382,15 @@
               <w:br/>
               <w:t xml:space="preserve">      "Currency": "KES",</w:t>
               <w:br/>
-              <w:t xml:space="preserve">      "QuantityInvoiced": 10,</w:t>
+              <w:t xml:space="preserve">      "QuantityInvoiced": 12,</w:t>
               <w:br/>
-              <w:t xml:space="preserve">      "AmountInvoiced": "583.30",</w:t>
+              <w:t xml:space="preserve">      "AmountInvoiced": "355.56",</w:t>
               <w:br/>
               <w:t xml:space="preserve">      "TransType": "Sale"</w:t>
               <w:br/>
               <w:t xml:space="preserve">    },</w:t>
               <w:br/>
-              <w:t xml:space="preserve">    "... up to 10,000 rows ..."</w:t>
+              <w:t xml:space="preserve">    "... up to 2,000 rows ..."</w:t>
               <w:br/>
               <w:t xml:space="preserve">  ],</w:t>
               <w:br/>
@@ -2529,29 +2469,29 @@
               <w:br/>
               <w:t xml:space="preserve">    {</w:t>
               <w:br/>
-              <w:t xml:space="preserve">      "STOREID": 2655,</w:t>
+              <w:t xml:space="preserve">      "StoreID": 2151,</w:t>
               <w:br/>
               <w:t xml:space="preserve">      "Discount": 0,</w:t>
               <w:br/>
-              <w:t xml:space="preserve">      "SalesRepID": 111,</w:t>
+              <w:t xml:space="preserve">      "SalesRepID": 112,</w:t>
               <w:br/>
-              <w:t xml:space="preserve">      "VATAmount": "80.46",</w:t>
+              <w:t xml:space="preserve">      "VATAmount": "49.04",</w:t>
               <w:br/>
               <w:t xml:space="preserve">      "RouteID": "",</w:t>
               <w:br/>
               <w:t xml:space="preserve">      "DistributorID": "1000097205",</w:t>
               <w:br/>
-              <w:t xml:space="preserve">      "ProductID": "3286535",</w:t>
+              <w:t xml:space="preserve">      "ProductID": "0238167",</w:t>
               <w:br/>
               <w:t xml:space="preserve">      "WarehouseID": 1925,</w:t>
               <w:br/>
-              <w:t xml:space="preserve">      "OrderNumber": 265,</w:t>
+              <w:t xml:space="preserve">      "OrderNumber": 286,</w:t>
               <w:br/>
-              <w:t xml:space="preserve">      "InvoiceNumber": 2857,</w:t>
+              <w:t xml:space="preserve">      "InvoiceNumber": 2901,</w:t>
               <w:br/>
-              <w:t xml:space="preserve">      "InvoiceDate": "24/09/2026",</w:t>
+              <w:t xml:space="preserve">      "InvoiceDate": "25/09/2026",</w:t>
               <w:br/>
-              <w:t xml:space="preserve">      "InvoiceTime": "15:46:26",</w:t>
+              <w:t xml:space="preserve">      "InvoiceTime": "15:15:36",</w:t>
               <w:br/>
               <w:t xml:space="preserve">      "InvoiceStatus": "Delivered",</w:t>
               <w:br/>
@@ -2559,9 +2499,9 @@
               <w:br/>
               <w:t xml:space="preserve">      "Currency": "KES",</w:t>
               <w:br/>
-              <w:t xml:space="preserve">      "QuantityInvoiced": 10,</w:t>
+              <w:t xml:space="preserve">      "QuantityInvoiced": 12,</w:t>
               <w:br/>
-              <w:t xml:space="preserve">      "AmountInvoiced": "583.30",</w:t>
+              <w:t xml:space="preserve">      "AmountInvoiced": "355.56",</w:t>
               <w:br/>
               <w:t xml:space="preserve">      "TransType": "Sale"</w:t>
               <w:br/>
@@ -5161,29 +5101,29 @@
               <w:br/>
               <w:t xml:space="preserve">    {</w:t>
               <w:br/>
-              <w:t xml:space="preserve">      "STOREID": 2655,</w:t>
+              <w:t xml:space="preserve">      "StoreID": 2151,</w:t>
               <w:br/>
               <w:t xml:space="preserve">      "Discount": 0,</w:t>
               <w:br/>
-              <w:t xml:space="preserve">      "SalesRepID": 111,</w:t>
+              <w:t xml:space="preserve">      "SalesRepID": 112,</w:t>
               <w:br/>
-              <w:t xml:space="preserve">      "VATAmount": "80.46",</w:t>
+              <w:t xml:space="preserve">      "VATAmount": "49.04",</w:t>
               <w:br/>
               <w:t xml:space="preserve">      "RouteID": "",</w:t>
               <w:br/>
               <w:t xml:space="preserve">      "DistributorID": "1000097205",</w:t>
               <w:br/>
-              <w:t xml:space="preserve">      "ProductID": "3286535",</w:t>
+              <w:t xml:space="preserve">      "ProductID": "0238167",</w:t>
               <w:br/>
               <w:t xml:space="preserve">      "WarehouseID": 1925,</w:t>
               <w:br/>
-              <w:t xml:space="preserve">      "OrderNumber": 265,</w:t>
+              <w:t xml:space="preserve">      "OrderNumber": 286,</w:t>
               <w:br/>
-              <w:t xml:space="preserve">      "InvoiceNumber": 2857,</w:t>
+              <w:t xml:space="preserve">      "InvoiceNumber": 2901,</w:t>
               <w:br/>
-              <w:t xml:space="preserve">      "InvoiceDate": "24/09/2026",</w:t>
+              <w:t xml:space="preserve">      "InvoiceDate": "25/09/2026",</w:t>
               <w:br/>
-              <w:t xml:space="preserve">      "InvoiceTime": "15:46:26",</w:t>
+              <w:t xml:space="preserve">      "InvoiceTime": "15:15:36",</w:t>
               <w:br/>
               <w:t xml:space="preserve">      "InvoiceStatus": "Delivered",</w:t>
               <w:br/>
@@ -5191,9 +5131,9 @@
               <w:br/>
               <w:t xml:space="preserve">      "Currency": "KES",</w:t>
               <w:br/>
-              <w:t xml:space="preserve">      "QuantityInvoiced": 10,</w:t>
+              <w:t xml:space="preserve">      "QuantityInvoiced": 12,</w:t>
               <w:br/>
-              <w:t xml:space="preserve">      "AmountInvoiced": "583.30",</w:t>
+              <w:t xml:space="preserve">      "AmountInvoiced": "355.56",</w:t>
               <w:br/>
               <w:t xml:space="preserve">      "TransType": "Sale"</w:t>
               <w:br/>
@@ -6251,25 +6191,25 @@
               <w:br/>
               <w:t xml:space="preserve">    {</w:t>
               <w:br/>
-              <w:t xml:space="preserve">      "StoreID": 2348,</w:t>
+              <w:t xml:space="preserve">      "StoreID": 2814,</w:t>
               <w:br/>
-              <w:t xml:space="preserve">      "SalesRepID": 108,</w:t>
+              <w:t xml:space="preserve">      "SalesRepID": 103,</w:t>
               <w:br/>
-              <w:t xml:space="preserve">      "RouteID": "",</w:t>
+              <w:t xml:space="preserve">      "RouteID": 115,</w:t>
               <w:br/>
-              <w:t xml:space="preserve">      "ProductID": "3049801",</w:t>
+              <w:t xml:space="preserve">      "ProductID": "3109556",</w:t>
               <w:br/>
               <w:t xml:space="preserve">      "DistributorID": "1000097205",</w:t>
               <w:br/>
-              <w:t xml:space="preserve">      "WarehouseID": 2503,</w:t>
+              <w:t xml:space="preserve">      "WarehouseID": 2166,</w:t>
               <w:br/>
-              <w:t xml:space="preserve">      "OrderNumber": 320,</w:t>
+              <w:t xml:space="preserve">      "OrderNumber": 366,</w:t>
               <w:br/>
-              <w:t xml:space="preserve">      "OrderDate": "24/09/2026",</w:t>
+              <w:t xml:space="preserve">      "OrderDate": "25/09/2026",</w:t>
               <w:br/>
-              <w:t xml:space="preserve">      "OrderStartTime": "",</w:t>
+              <w:t xml:space="preserve">      "OrderStartTime": "17:42:38",</w:t>
               <w:br/>
-              <w:t xml:space="preserve">      "OrderEndTime": "",</w:t>
+              <w:t xml:space="preserve">      "OrderEndTime": "18:12:59",</w:t>
               <w:br/>
               <w:t xml:space="preserve">      "OrderStatus": "Open",</w:t>
               <w:br/>
@@ -6277,13 +6217,13 @@
               <w:br/>
               <w:t xml:space="preserve">      "Currency": "KES",</w:t>
               <w:br/>
-              <w:t xml:space="preserve">      "QuantityOrdered": 5,</w:t>
+              <w:t xml:space="preserve">      "QuantityOrdered": 6,</w:t>
               <w:br/>
-              <w:t xml:space="preserve">      "AmountOrdered": "590.90",</w:t>
+              <w:t xml:space="preserve">      "AmountOrdered": "1104.00",</w:t>
               <w:br/>
               <w:t xml:space="preserve">      "Discount": 0,</w:t>
               <w:br/>
-              <w:t xml:space="preserve">      "VATAmount": "81.50"</w:t>
+              <w:t xml:space="preserve">      "VATAmount": "152.28"</w:t>
               <w:br/>
               <w:t xml:space="preserve">    }</w:t>
               <w:br/>
@@ -6666,7 +6606,7 @@
               <w:br/>
               <w:t xml:space="preserve">      "ProductSKU": "AWICK FRESHMATIC ROSE  + GADGET SEEDING PRICE 250ML (4)",</w:t>
               <w:br/>
-              <w:t xml:space="preserve">      "UnitofMeasure": "PIECE"</w:t>
+              <w:t xml:space="preserve">      "UnitOfMeasure": "PIECE"</w:t>
               <w:br/>
               <w:t xml:space="preserve">    }</w:t>
               <w:br/>
@@ -9290,9 +9230,9 @@
               <w:br/>
               <w:t xml:space="preserve">    {</w:t>
               <w:br/>
-              <w:t xml:space="preserve">      "ProductSKU": "3300090",</w:t>
+              <w:t xml:space="preserve">      "ProductID": "3300090",</w:t>
               <w:br/>
-              <w:t xml:space="preserve">      "UnitofMeasure": "PIECE",</w:t>
+              <w:t xml:space="preserve">      "UnitOfMeasure": "PIECE",</w:t>
               <w:br/>
               <w:t xml:space="preserve">      "DistributorWarehouseCode": "EMBU STOCKPOINT",</w:t>
               <w:br/>
@@ -10354,7 +10294,37 @@
         <w:color w:val="1F4E79"/>
         <w:sz w:val="18"/>
       </w:rPr>
-      <w:t>SAT Datashare Client Test Guide — Kenya</w:t>
+      <w:t xml:space="preserve">Confidential  ·  v1.0  ·  Page </w:t>
+    </w:r>
+    <w:r>
+      <w:rPr>
+        <w:rFonts w:ascii="Calibri" w:hAnsi="Calibri" w:cs="Calibri" w:eastAsia="Calibri"/>
+        <w:b/>
+        <w:i w:val="0"/>
+        <w:color w:val="1F4E79"/>
+        <w:sz w:val="18"/>
+      </w:rPr>
+      <w:fldChar w:fldCharType="begin"/>
+    </w:r>
+    <w:r>
+      <w:rPr>
+        <w:rFonts w:ascii="Calibri" w:hAnsi="Calibri" w:cs="Calibri" w:eastAsia="Calibri"/>
+        <w:b/>
+        <w:i w:val="0"/>
+        <w:color w:val="1F4E79"/>
+        <w:sz w:val="18"/>
+      </w:rPr>
+      <w:instrText xml:space="preserve"> PAGE </w:instrText>
+    </w:r>
+    <w:r>
+      <w:rPr>
+        <w:rFonts w:ascii="Calibri" w:hAnsi="Calibri" w:cs="Calibri" w:eastAsia="Calibri"/>
+        <w:b/>
+        <w:i w:val="0"/>
+        <w:color w:val="1F4E79"/>
+        <w:sz w:val="18"/>
+      </w:rPr>
+      <w:fldChar w:fldCharType="end"/>
     </w:r>
   </w:p>
 </w:ftr>

</xml_diff>